<commit_message>
feat: perfectly group cards, lists and sections in Word document without duplicate headers, buttons, and section-tags
</commit_message>
<xml_diff>
--- a/site/сайт-текст/KSK-Patients-Landing-Text-DE.docx
+++ b/site/сайт-текст/KSK-Patients-Landing-Text-DE.docx
@@ -60,21 +60,21 @@
     </w:p>
     <w:p>
       <w:pPr>
-        <w:spacing w:before="400" w:after="80"/>
+        <w:spacing w:before="480" w:after="80"/>
       </w:pPr>
       <w:r>
         <w:rPr>
           <w:rFonts w:ascii="Georgia" w:hAnsi="Georgia"/>
           <w:b/>
           <w:color w:val="4C2B73"/>
-          <w:sz w:val="30"/>
+          <w:sz w:val="32"/>
         </w:rPr>
         <w:t>PATIENTEN-LANDINGPAGE</w:t>
       </w:r>
     </w:p>
     <w:p>
       <w:pPr>
-        <w:spacing w:after="200"/>
+        <w:spacing w:after="320"/>
       </w:pPr>
       <w:r>
         <w:rPr>
@@ -88,21 +88,22 @@
     </w:p>
     <w:p>
       <w:pPr>
-        <w:spacing w:before="240" w:after="120"/>
+        <w:keepNext/>
+        <w:spacing w:before="280" w:after="160"/>
       </w:pPr>
       <w:r>
         <w:rPr>
           <w:rFonts w:ascii="Georgia" w:hAnsi="Georgia"/>
           <w:b/>
-          <w:color w:val="2C2C2C"/>
-          <w:sz w:val="23"/>
+          <w:color w:val="4C2B73"/>
+          <w:sz w:val="26"/>
         </w:rPr>
-        <w:t>Block: Bereich 1</w:t>
+        <w:t>Ihr Angehöriger braucht Pflege? &lt;em style="color: var(--violet); font-style: italic;"&gt;Wir sind für Sie da.</w:t>
       </w:r>
     </w:p>
     <w:p>
       <w:pPr>
-        <w:spacing w:after="60"/>
+        <w:spacing w:after="120"/>
       </w:pPr>
       <w:r>
         <w:rPr>
@@ -110,26 +111,97 @@
           <w:color w:val="2C2C2C"/>
           <w:sz w:val="20"/>
         </w:rPr>
-        <w:t>•  Die Krankenkasse übernimmt die Kosten für die Intensivpflege in der Regel vollständig. Wir kümmern uns um die gesamte Kommunikation mit den Kostenträgern — Sie müssen sich um nichts kümmern.</w:t>
+        <w:t>Die Krankenkasse übernimmt die Kosten für die Intensivpflege in der Regel vollständig. Wir kümmern uns um die gesamte Kommunikation mit den Kostenträgern — Sie müssen sich um nichts kümmern.</w:t>
       </w:r>
     </w:p>
     <w:p>
       <w:pPr>
-        <w:spacing w:before="240" w:after="120"/>
+        <w:keepNext/>
+        <w:spacing w:before="280" w:after="160"/>
       </w:pPr>
       <w:r>
         <w:rPr>
           <w:rFonts w:ascii="Georgia" w:hAnsi="Georgia"/>
           <w:b/>
-          <w:color w:val="2C2C2C"/>
-          <w:sz w:val="23"/>
+          <w:color w:val="4C2B73"/>
+          <w:sz w:val="26"/>
         </w:rPr>
-        <w:t>Block: Formular</w:t>
+        <w:t>Wir nehmen Ihnen alles ab</w:t>
       </w:r>
     </w:p>
     <w:p>
       <w:pPr>
-        <w:spacing w:after="60"/>
+        <w:spacing w:after="160"/>
+      </w:pPr>
+      <w:r>
+        <w:rPr>
+          <w:rFonts w:ascii="Arial" w:hAnsi="Arial"/>
+          <w:b/>
+          <w:color w:val="2C2C2C"/>
+          <w:sz w:val="20"/>
+        </w:rPr>
+        <w:t>Kostenübernahme durch Krankenkasse — wir übernehmen die Kommunikation</w:t>
+      </w:r>
+    </w:p>
+    <w:p>
+      <w:pPr>
+        <w:spacing w:after="160"/>
+      </w:pPr>
+      <w:r>
+        <w:rPr>
+          <w:rFonts w:ascii="Arial" w:hAnsi="Arial"/>
+          <w:b/>
+          <w:color w:val="2C2C2C"/>
+          <w:sz w:val="20"/>
+        </w:rPr>
+        <w:t>Pflege bei Ihnen zu Hause — oder in unserer Einrichtung in Kassel</w:t>
+      </w:r>
+    </w:p>
+    <w:p>
+      <w:pPr>
+        <w:spacing w:after="160"/>
+      </w:pPr>
+      <w:r>
+        <w:rPr>
+          <w:rFonts w:ascii="Arial" w:hAnsi="Arial"/>
+          <w:b/>
+          <w:color w:val="2C2C2C"/>
+          <w:sz w:val="20"/>
+        </w:rPr>
+        <w:t>Examinierte Pflegefachkräfte — 5,5 Mitarbeiter pro Patient</w:t>
+      </w:r>
+    </w:p>
+    <w:p>
+      <w:pPr>
+        <w:spacing w:after="160"/>
+      </w:pPr>
+      <w:r>
+        <w:rPr>
+          <w:rFonts w:ascii="Arial" w:hAnsi="Arial"/>
+          <w:b/>
+          <w:color w:val="2C2C2C"/>
+          <w:sz w:val="20"/>
+        </w:rPr>
+        <w:t>Rückmeldung innerhalb 24 Stunden — garantiert</w:t>
+      </w:r>
+    </w:p>
+    <w:p>
+      <w:pPr>
+        <w:spacing w:after="160"/>
+      </w:pPr>
+      <w:r>
+        <w:rPr>
+          <w:rFonts w:ascii="Arial" w:hAnsi="Arial"/>
+          <w:b/>
+          <w:color w:val="2C2C2C"/>
+          <w:sz w:val="20"/>
+        </w:rPr>
+        <w:t>Versorgung in ganz Hessen — seit 2013</w:t>
+      </w:r>
+    </w:p>
+    <w:p>
+      <w:pPr>
+        <w:spacing w:after="120"/>
       </w:pPr>
       <w:r>
         <w:rPr>
@@ -137,12 +209,27 @@
           <w:color w:val="2C2C2C"/>
           <w:sz w:val="20"/>
         </w:rPr>
-        <w:t>•  Was wir für Sie tun</w:t>
+        <w:t>"Das Wohl des Patienten ist oberstes Gesetz."</w:t>
       </w:r>
     </w:p>
     <w:p>
       <w:pPr>
-        <w:spacing w:after="60"/>
+        <w:keepNext/>
+        <w:spacing w:before="280" w:after="160"/>
+      </w:pPr>
+      <w:r>
+        <w:rPr>
+          <w:rFonts w:ascii="Georgia" w:hAnsi="Georgia"/>
+          <w:b/>
+          <w:color w:val="4C2B73"/>
+          <w:sz w:val="26"/>
+        </w:rPr>
+        <w:t>Welche Patienten wir versorgen</w:t>
+      </w:r>
+    </w:p>
+    <w:p>
+      <w:pPr>
+        <w:spacing w:after="120"/>
       </w:pPr>
       <w:r>
         <w:rPr>
@@ -150,12 +237,142 @@
           <w:color w:val="2C2C2C"/>
           <w:sz w:val="20"/>
         </w:rPr>
-        <w:t>•  Wir nehmen Ihnen alles ab</w:t>
+        <w:t>Nicht sicher ob wir helfen können? Rufen Sie uns an — kostenlos und unverbindlich.</w:t>
       </w:r>
     </w:p>
     <w:p>
       <w:pPr>
-        <w:spacing w:after="60"/>
+        <w:keepNext/>
+        <w:spacing w:before="280" w:after="160"/>
+      </w:pPr>
+      <w:r>
+        <w:rPr>
+          <w:rFonts w:ascii="Georgia" w:hAnsi="Georgia"/>
+          <w:b/>
+          <w:color w:val="4C2B73"/>
+          <w:sz w:val="26"/>
+        </w:rPr>
+        <w:t>In 3 Schritten zur Versorgung</w:t>
+      </w:r>
+    </w:p>
+    <w:p>
+      <w:pPr>
+        <w:spacing w:after="160"/>
+      </w:pPr>
+      <w:r>
+        <w:rPr>
+          <w:rFonts w:ascii="Arial" w:hAnsi="Arial"/>
+          <w:b/>
+          <w:color w:val="2C2C2C"/>
+          <w:sz w:val="20"/>
+        </w:rPr>
+        <w:t>Kostenloses Erstgespräch</w:t>
+      </w:r>
+      <w:r>
+        <w:br/>
+      </w:r>
+      <w:r>
+        <w:rPr>
+          <w:rFonts w:ascii="Arial" w:hAnsi="Arial"/>
+          <w:color w:val="2C2C2C"/>
+          <w:sz w:val="20"/>
+        </w:rPr>
+        <w:t>Wir lernen Ihre Situation kennen — telefonisch oder persönlich.</w:t>
+      </w:r>
+    </w:p>
+    <w:p>
+      <w:pPr>
+        <w:spacing w:after="160"/>
+      </w:pPr>
+      <w:r>
+        <w:rPr>
+          <w:rFonts w:ascii="Arial" w:hAnsi="Arial"/>
+          <w:b/>
+          <w:color w:val="2C2C2C"/>
+          <w:sz w:val="20"/>
+        </w:rPr>
+        <w:t>Kostenloses Erstgespräch</w:t>
+      </w:r>
+      <w:r>
+        <w:br/>
+      </w:r>
+      <w:r>
+        <w:rPr>
+          <w:rFonts w:ascii="Arial" w:hAnsi="Arial"/>
+          <w:color w:val="2C2C2C"/>
+          <w:sz w:val="20"/>
+        </w:rPr>
+        <w:t>Wir lernen Ihre Situation kennen — telefonisch oder persönlich.</w:t>
+      </w:r>
+    </w:p>
+    <w:p>
+      <w:pPr>
+        <w:spacing w:after="160"/>
+      </w:pPr>
+      <w:r>
+        <w:rPr>
+          <w:rFonts w:ascii="Arial" w:hAnsi="Arial"/>
+          <w:b/>
+          <w:color w:val="2C2C2C"/>
+          <w:sz w:val="20"/>
+        </w:rPr>
+        <w:t>Individuelle Planung</w:t>
+      </w:r>
+      <w:r>
+        <w:br/>
+      </w:r>
+      <w:r>
+        <w:rPr>
+          <w:rFonts w:ascii="Arial" w:hAnsi="Arial"/>
+          <w:color w:val="2C2C2C"/>
+          <w:sz w:val="20"/>
+        </w:rPr>
+        <w:t>Wir erstellen den Pflegeplan und klären die Kostenübernahme mit der Kasse.</w:t>
+      </w:r>
+    </w:p>
+    <w:p>
+      <w:pPr>
+        <w:spacing w:after="160"/>
+      </w:pPr>
+      <w:r>
+        <w:rPr>
+          <w:rFonts w:ascii="Arial" w:hAnsi="Arial"/>
+          <w:b/>
+          <w:color w:val="2C2C2C"/>
+          <w:sz w:val="20"/>
+        </w:rPr>
+        <w:t>Versorgungsbeginn</w:t>
+      </w:r>
+      <w:r>
+        <w:br/>
+      </w:r>
+      <w:r>
+        <w:rPr>
+          <w:rFonts w:ascii="Arial" w:hAnsi="Arial"/>
+          <w:color w:val="2C2C2C"/>
+          <w:sz w:val="20"/>
+        </w:rPr>
+        <w:t>Ihr persönliches Pflegeteam beginnt die Betreuung — zuverlässig und menschlich.</w:t>
+      </w:r>
+    </w:p>
+    <w:p>
+      <w:pPr>
+        <w:keepNext/>
+        <w:spacing w:before="280" w:after="160"/>
+      </w:pPr>
+      <w:r>
+        <w:rPr>
+          <w:rFonts w:ascii="Georgia" w:hAnsi="Georgia"/>
+          <w:b/>
+          <w:color w:val="4C2B73"/>
+          <w:sz w:val="26"/>
+        </w:rPr>
+        <w:t>Jetzt kostenlos anfragen</w:t>
+      </w:r>
+    </w:p>
+    <w:p>
+      <w:pPr>
+        <w:spacing w:after="120"/>
       </w:pPr>
       <w:r>
         <w:rPr>
@@ -163,729 +380,7 @@
           <w:color w:val="2C2C2C"/>
           <w:sz w:val="20"/>
         </w:rPr>
-        <w:t>•  Kostenlose Erstberatung — unverbindlich und persönlich</w:t>
-      </w:r>
-    </w:p>
-    <w:p>
-      <w:pPr>
-        <w:spacing w:after="60"/>
-      </w:pPr>
-      <w:r>
-        <w:rPr>
-          <w:rFonts w:ascii="Arial" w:hAnsi="Arial"/>
-          <w:color w:val="2C2C2C"/>
-          <w:sz w:val="20"/>
-        </w:rPr>
-        <w:t>•  Kostenübernahme durch Krankenkasse — wir übernehmen die Kommunikation</w:t>
-      </w:r>
-    </w:p>
-    <w:p>
-      <w:pPr>
-        <w:spacing w:after="60"/>
-      </w:pPr>
-      <w:r>
-        <w:rPr>
-          <w:rFonts w:ascii="Arial" w:hAnsi="Arial"/>
-          <w:color w:val="2C2C2C"/>
-          <w:sz w:val="20"/>
-        </w:rPr>
-        <w:t>•  Pflege bei Ihnen zu Hause — oder in unserer Einrichtung in Kassel</w:t>
-      </w:r>
-    </w:p>
-    <w:p>
-      <w:pPr>
-        <w:spacing w:after="60"/>
-      </w:pPr>
-      <w:r>
-        <w:rPr>
-          <w:rFonts w:ascii="Arial" w:hAnsi="Arial"/>
-          <w:color w:val="2C2C2C"/>
-          <w:sz w:val="20"/>
-        </w:rPr>
-        <w:t>•  Examinierte Pflegefachkräfte — 5,5 Mitarbeiter pro Patient</w:t>
-      </w:r>
-    </w:p>
-    <w:p>
-      <w:pPr>
-        <w:spacing w:after="60"/>
-      </w:pPr>
-      <w:r>
-        <w:rPr>
-          <w:rFonts w:ascii="Arial" w:hAnsi="Arial"/>
-          <w:color w:val="2C2C2C"/>
-          <w:sz w:val="20"/>
-        </w:rPr>
-        <w:t>•  Rückmeldung innerhalb 24 Stunden — garantiert</w:t>
-      </w:r>
-    </w:p>
-    <w:p>
-      <w:pPr>
-        <w:spacing w:after="60"/>
-      </w:pPr>
-      <w:r>
-        <w:rPr>
-          <w:rFonts w:ascii="Arial" w:hAnsi="Arial"/>
-          <w:color w:val="2C2C2C"/>
-          <w:sz w:val="20"/>
-        </w:rPr>
-        <w:t>•  Versorgung in ganz Hessen — seit 2013</w:t>
-      </w:r>
-    </w:p>
-    <w:p>
-      <w:pPr>
-        <w:spacing w:after="60"/>
-      </w:pPr>
-      <w:r>
-        <w:rPr>
-          <w:rFonts w:ascii="Arial" w:hAnsi="Arial"/>
-          <w:i/>
-          <w:color w:val="2C2C2C"/>
-          <w:sz w:val="20"/>
-        </w:rPr>
-        <w:t xml:space="preserve">   "Das Wohl des Patienten ist oberstes Gesetz."</w:t>
-      </w:r>
-    </w:p>
-    <w:p>
-      <w:pPr>
-        <w:spacing w:after="60"/>
-      </w:pPr>
-      <w:r>
-        <w:rPr>
-          <w:rFonts w:ascii="Arial" w:hAnsi="Arial"/>
-          <w:color w:val="2C2C2C"/>
-          <w:sz w:val="20"/>
-        </w:rPr>
-        <w:t>•  — Unser Leitbild</w:t>
-      </w:r>
-    </w:p>
-    <w:p>
-      <w:pPr>
-        <w:spacing w:after="60"/>
-      </w:pPr>
-      <w:r>
-        <w:rPr>
-          <w:rFonts w:ascii="Arial" w:hAnsi="Arial"/>
-          <w:color w:val="2C2C2C"/>
-          <w:sz w:val="20"/>
-        </w:rPr>
-        <w:t>•  Lieber direkt anrufen?</w:t>
-      </w:r>
-    </w:p>
-    <w:p>
-      <w:pPr>
-        <w:spacing w:after="60"/>
-      </w:pPr>
-      <w:r>
-        <w:rPr>
-          <w:rFonts w:ascii="Arial" w:hAnsi="Arial"/>
-          <w:color w:val="2C2C2C"/>
-          <w:sz w:val="20"/>
-        </w:rPr>
-        <w:t>•  05693 / 9189907</w:t>
-      </w:r>
-    </w:p>
-    <w:p>
-      <w:pPr>
-        <w:spacing w:after="60"/>
-      </w:pPr>
-      <w:r>
-        <w:rPr>
-          <w:rFonts w:ascii="Arial" w:hAnsi="Arial"/>
-          <w:color w:val="2C2C2C"/>
-          <w:sz w:val="20"/>
-        </w:rPr>
-        <w:t>•  0170 / 7652593 (Mobil)</w:t>
-      </w:r>
-    </w:p>
-    <w:p>
-      <w:pPr>
-        <w:spacing w:after="60"/>
-      </w:pPr>
-      <w:r>
-        <w:rPr>
-          <w:rFonts w:ascii="Arial" w:hAnsi="Arial"/>
-          <w:color w:val="2C2C2C"/>
-          <w:sz w:val="20"/>
-        </w:rPr>
-        <w:t>•  Jetzt Beratung anfragen</w:t>
-      </w:r>
-    </w:p>
-    <w:p>
-      <w:pPr>
-        <w:spacing w:after="60"/>
-      </w:pPr>
-      <w:r>
-        <w:rPr>
-          <w:rFonts w:ascii="Arial" w:hAnsi="Arial"/>
-          <w:color w:val="2C2C2C"/>
-          <w:sz w:val="20"/>
-        </w:rPr>
-        <w:t>•  Kostenlos. Unverbindlich. Wir melden uns innerhalb von 24 Stunden.</w:t>
-      </w:r>
-    </w:p>
-    <w:p>
-      <w:pPr>
-        <w:spacing w:after="60"/>
-      </w:pPr>
-      <w:r>
-        <w:rPr>
-          <w:rFonts w:ascii="Arial" w:hAnsi="Arial"/>
-          <w:color w:val="2C2C2C"/>
-          <w:sz w:val="20"/>
-        </w:rPr>
-        <w:t>•  Vorname</w:t>
-      </w:r>
-    </w:p>
-    <w:p>
-      <w:pPr>
-        <w:spacing w:after="60"/>
-      </w:pPr>
-      <w:r>
-        <w:rPr>
-          <w:rFonts w:ascii="Arial" w:hAnsi="Arial"/>
-          <w:color w:val="2C2C2C"/>
-          <w:sz w:val="20"/>
-        </w:rPr>
-        <w:t>•  Nachname</w:t>
-      </w:r>
-    </w:p>
-    <w:p>
-      <w:pPr>
-        <w:spacing w:after="60"/>
-      </w:pPr>
-      <w:r>
-        <w:rPr>
-          <w:rFonts w:ascii="Arial" w:hAnsi="Arial"/>
-          <w:color w:val="2C2C2C"/>
-          <w:sz w:val="20"/>
-        </w:rPr>
-        <w:t>•  Telefon *</w:t>
-      </w:r>
-    </w:p>
-    <w:p>
-      <w:pPr>
-        <w:spacing w:after="60"/>
-      </w:pPr>
-      <w:r>
-        <w:rPr>
-          <w:rFonts w:ascii="Arial" w:hAnsi="Arial"/>
-          <w:color w:val="2C2C2C"/>
-          <w:sz w:val="20"/>
-        </w:rPr>
-        <w:t>•  E-Mail (optional)</w:t>
-      </w:r>
-    </w:p>
-    <w:p>
-      <w:pPr>
-        <w:spacing w:after="60"/>
-      </w:pPr>
-      <w:r>
-        <w:rPr>
-          <w:rFonts w:ascii="Arial" w:hAnsi="Arial"/>
-          <w:color w:val="2C2C2C"/>
-          <w:sz w:val="20"/>
-        </w:rPr>
-        <w:t>•  Diagnose oder Situation (optional) z.B. Beatmungspatient, suchen häusliche Pflege in Kassel...</w:t>
-      </w:r>
-    </w:p>
-    <w:p>
-      <w:pPr>
-        <w:spacing w:after="60"/>
-      </w:pPr>
-      <w:r>
-        <w:rPr>
-          <w:rFonts w:ascii="Arial" w:hAnsi="Arial"/>
-          <w:color w:val="2C2C2C"/>
-          <w:sz w:val="20"/>
-        </w:rPr>
-        <w:t>•  Ich stimme der Datenschutzerklärung zu.</w:t>
-      </w:r>
-    </w:p>
-    <w:p>
-      <w:pPr>
-        <w:spacing w:after="60"/>
-      </w:pPr>
-      <w:r>
-        <w:rPr>
-          <w:rFonts w:ascii="Arial" w:hAnsi="Arial"/>
-          <w:color w:val="2C2C2C"/>
-          <w:sz w:val="20"/>
-        </w:rPr>
-        <w:t>•  Beratung anfragen — kostenlos</w:t>
-      </w:r>
-    </w:p>
-    <w:p>
-      <w:pPr>
-        <w:spacing w:after="60"/>
-      </w:pPr>
-      <w:r>
-        <w:rPr>
-          <w:rFonts w:ascii="Arial" w:hAnsi="Arial"/>
-          <w:color w:val="2C2C2C"/>
-          <w:sz w:val="20"/>
-        </w:rPr>
-        <w:t>•  Keine Werbung. Keine Datenweitergabe. DSGVO-konform.</w:t>
-      </w:r>
-    </w:p>
-    <w:p>
-      <w:pPr>
-        <w:spacing w:before="240" w:after="120"/>
-      </w:pPr>
-      <w:r>
-        <w:rPr>
-          <w:rFonts w:ascii="Georgia" w:hAnsi="Georgia"/>
-          <w:b/>
-          <w:color w:val="2C2C2C"/>
-          <w:sz w:val="23"/>
-        </w:rPr>
-        <w:t>Block: Welche Patienten wir versorgen</w:t>
-      </w:r>
-    </w:p>
-    <w:p>
-      <w:pPr>
-        <w:spacing w:after="60"/>
-      </w:pPr>
-      <w:r>
-        <w:rPr>
-          <w:rFonts w:ascii="Arial" w:hAnsi="Arial"/>
-          <w:color w:val="2C2C2C"/>
-          <w:sz w:val="20"/>
-        </w:rPr>
-        <w:t>•  Diagnosen</w:t>
-      </w:r>
-    </w:p>
-    <w:p>
-      <w:pPr>
-        <w:spacing w:after="60"/>
-      </w:pPr>
-      <w:r>
-        <w:rPr>
-          <w:rFonts w:ascii="Arial" w:hAnsi="Arial"/>
-          <w:color w:val="2C2C2C"/>
-          <w:sz w:val="20"/>
-        </w:rPr>
-        <w:t>•  Welche Patienten wir versorgen</w:t>
-      </w:r>
-    </w:p>
-    <w:p>
-      <w:pPr>
-        <w:spacing w:after="60"/>
-      </w:pPr>
-      <w:r>
-        <w:rPr>
-          <w:rFonts w:ascii="Arial" w:hAnsi="Arial"/>
-          <w:color w:val="2C2C2C"/>
-          <w:sz w:val="20"/>
-        </w:rPr>
-        <w:t>•  Beatmungspatienten</w:t>
-      </w:r>
-    </w:p>
-    <w:p>
-      <w:pPr>
-        <w:spacing w:after="60"/>
-      </w:pPr>
-      <w:r>
-        <w:rPr>
-          <w:rFonts w:ascii="Arial" w:hAnsi="Arial"/>
-          <w:color w:val="2C2C2C"/>
-          <w:sz w:val="20"/>
-        </w:rPr>
-        <w:t>•  Wachkoma (Apallisches Syndrom)</w:t>
-      </w:r>
-    </w:p>
-    <w:p>
-      <w:pPr>
-        <w:spacing w:after="60"/>
-      </w:pPr>
-      <w:r>
-        <w:rPr>
-          <w:rFonts w:ascii="Arial" w:hAnsi="Arial"/>
-          <w:color w:val="2C2C2C"/>
-          <w:sz w:val="20"/>
-        </w:rPr>
-        <w:t>•  ALS</w:t>
-      </w:r>
-    </w:p>
-    <w:p>
-      <w:pPr>
-        <w:spacing w:after="60"/>
-      </w:pPr>
-      <w:r>
-        <w:rPr>
-          <w:rFonts w:ascii="Arial" w:hAnsi="Arial"/>
-          <w:color w:val="2C2C2C"/>
-          <w:sz w:val="20"/>
-        </w:rPr>
-        <w:t>•  Neurologische Erkrankungen</w:t>
-      </w:r>
-    </w:p>
-    <w:p>
-      <w:pPr>
-        <w:spacing w:after="60"/>
-      </w:pPr>
-      <w:r>
-        <w:rPr>
-          <w:rFonts w:ascii="Arial" w:hAnsi="Arial"/>
-          <w:color w:val="2C2C2C"/>
-          <w:sz w:val="20"/>
-        </w:rPr>
-        <w:t>•  Querschnittslähmung</w:t>
-      </w:r>
-    </w:p>
-    <w:p>
-      <w:pPr>
-        <w:spacing w:after="60"/>
-      </w:pPr>
-      <w:r>
-        <w:rPr>
-          <w:rFonts w:ascii="Arial" w:hAnsi="Arial"/>
-          <w:color w:val="2C2C2C"/>
-          <w:sz w:val="20"/>
-        </w:rPr>
-        <w:t>•  Schädel-Hirn-Trauma</w:t>
-      </w:r>
-    </w:p>
-    <w:p>
-      <w:pPr>
-        <w:spacing w:after="60"/>
-      </w:pPr>
-      <w:r>
-        <w:rPr>
-          <w:rFonts w:ascii="Arial" w:hAnsi="Arial"/>
-          <w:color w:val="2C2C2C"/>
-          <w:sz w:val="20"/>
-        </w:rPr>
-        <w:t>•  Nicht sicher ob wir helfen können? Rufen Sie uns an — kostenlos und unverbindlich.</w:t>
-      </w:r>
-    </w:p>
-    <w:p>
-      <w:pPr>
-        <w:spacing w:after="60"/>
-      </w:pPr>
-      <w:r>
-        <w:rPr>
-          <w:rFonts w:ascii="Arial" w:hAnsi="Arial"/>
-          <w:color w:val="2C2C2C"/>
-          <w:sz w:val="20"/>
-        </w:rPr>
-        <w:t>•  05693 / 9189907</w:t>
-      </w:r>
-    </w:p>
-    <w:p>
-      <w:pPr>
-        <w:spacing w:before="240" w:after="120"/>
-      </w:pPr>
-      <w:r>
-        <w:rPr>
-          <w:rFonts w:ascii="Georgia" w:hAnsi="Georgia"/>
-          <w:b/>
-          <w:color w:val="2C2C2C"/>
-          <w:sz w:val="23"/>
-        </w:rPr>
-        <w:t>Block: Welche Patienten wir versorgen</w:t>
-      </w:r>
-    </w:p>
-    <w:p>
-      <w:pPr>
-        <w:spacing w:after="60"/>
-      </w:pPr>
-      <w:r>
-        <w:rPr>
-          <w:rFonts w:ascii="Arial" w:hAnsi="Arial"/>
-          <w:color w:val="2C2C2C"/>
-          <w:sz w:val="20"/>
-        </w:rPr>
-        <w:t>•  Diagnosen</w:t>
-      </w:r>
-    </w:p>
-    <w:p>
-      <w:pPr>
-        <w:spacing w:after="60"/>
-      </w:pPr>
-      <w:r>
-        <w:rPr>
-          <w:rFonts w:ascii="Arial" w:hAnsi="Arial"/>
-          <w:color w:val="2C2C2C"/>
-          <w:sz w:val="20"/>
-        </w:rPr>
-        <w:t>•  Welche Patienten wir versorgen</w:t>
-      </w:r>
-    </w:p>
-    <w:p>
-      <w:pPr>
-        <w:spacing w:before="240" w:after="120"/>
-      </w:pPr>
-      <w:r>
-        <w:rPr>
-          <w:rFonts w:ascii="Georgia" w:hAnsi="Georgia"/>
-          <w:b/>
-          <w:color w:val="2C2C2C"/>
-          <w:sz w:val="23"/>
-        </w:rPr>
-        <w:t>Block: In 3 Schritten zur Versorgung</w:t>
-      </w:r>
-    </w:p>
-    <w:p>
-      <w:pPr>
-        <w:spacing w:after="60"/>
-      </w:pPr>
-      <w:r>
-        <w:rPr>
-          <w:rFonts w:ascii="Arial" w:hAnsi="Arial"/>
-          <w:color w:val="2C2C2C"/>
-          <w:sz w:val="20"/>
-        </w:rPr>
-        <w:t>•  So funktioniert es</w:t>
-      </w:r>
-    </w:p>
-    <w:p>
-      <w:pPr>
-        <w:spacing w:after="60"/>
-      </w:pPr>
-      <w:r>
-        <w:rPr>
-          <w:rFonts w:ascii="Arial" w:hAnsi="Arial"/>
-          <w:color w:val="2C2C2C"/>
-          <w:sz w:val="20"/>
-        </w:rPr>
-        <w:t>•  In 3 Schritten zur Versorgung</w:t>
-      </w:r>
-    </w:p>
-    <w:p>
-      <w:pPr>
-        <w:spacing w:after="60"/>
-      </w:pPr>
-      <w:r>
-        <w:rPr>
-          <w:rFonts w:ascii="Arial" w:hAnsi="Arial"/>
-          <w:color w:val="2C2C2C"/>
-          <w:sz w:val="20"/>
-        </w:rPr>
-        <w:t>•  Kostenloses Erstgespräch</w:t>
-      </w:r>
-    </w:p>
-    <w:p>
-      <w:pPr>
-        <w:spacing w:after="60"/>
-      </w:pPr>
-      <w:r>
-        <w:rPr>
-          <w:rFonts w:ascii="Arial" w:hAnsi="Arial"/>
-          <w:color w:val="2C2C2C"/>
-          <w:sz w:val="20"/>
-        </w:rPr>
-        <w:t>•  Wir lernen Ihre Situation kennen — telefonisch oder persönlich.</w:t>
-      </w:r>
-    </w:p>
-    <w:p>
-      <w:pPr>
-        <w:spacing w:after="60"/>
-      </w:pPr>
-      <w:r>
-        <w:rPr>
-          <w:rFonts w:ascii="Arial" w:hAnsi="Arial"/>
-          <w:color w:val="2C2C2C"/>
-          <w:sz w:val="20"/>
-        </w:rPr>
-        <w:t>•  Individuelle Planung</w:t>
-      </w:r>
-    </w:p>
-    <w:p>
-      <w:pPr>
-        <w:spacing w:after="60"/>
-      </w:pPr>
-      <w:r>
-        <w:rPr>
-          <w:rFonts w:ascii="Arial" w:hAnsi="Arial"/>
-          <w:color w:val="2C2C2C"/>
-          <w:sz w:val="20"/>
-        </w:rPr>
-        <w:t>•  Wir erstellen den Pflegeplan und klären die Kostenübernahme mit der Kasse.</w:t>
-      </w:r>
-    </w:p>
-    <w:p>
-      <w:pPr>
-        <w:spacing w:after="60"/>
-      </w:pPr>
-      <w:r>
-        <w:rPr>
-          <w:rFonts w:ascii="Arial" w:hAnsi="Arial"/>
-          <w:color w:val="2C2C2C"/>
-          <w:sz w:val="20"/>
-        </w:rPr>
-        <w:t>•  Versorgungsbeginn</w:t>
-      </w:r>
-    </w:p>
-    <w:p>
-      <w:pPr>
-        <w:spacing w:after="60"/>
-      </w:pPr>
-      <w:r>
-        <w:rPr>
-          <w:rFonts w:ascii="Arial" w:hAnsi="Arial"/>
-          <w:color w:val="2C2C2C"/>
-          <w:sz w:val="20"/>
-        </w:rPr>
-        <w:t>•  Ihr persönliches Pflegeteam beginnt die Betreuung — zuverlässig und menschlich.</w:t>
-      </w:r>
-    </w:p>
-    <w:p>
-      <w:pPr>
-        <w:spacing w:before="240" w:after="120"/>
-      </w:pPr>
-      <w:r>
-        <w:rPr>
-          <w:rFonts w:ascii="Georgia" w:hAnsi="Georgia"/>
-          <w:b/>
-          <w:color w:val="2C2C2C"/>
-          <w:sz w:val="23"/>
-        </w:rPr>
-        <w:t>Block: In 3 Schritten zur Versorgung</w:t>
-      </w:r>
-    </w:p>
-    <w:p>
-      <w:pPr>
-        <w:spacing w:after="60"/>
-      </w:pPr>
-      <w:r>
-        <w:rPr>
-          <w:rFonts w:ascii="Arial" w:hAnsi="Arial"/>
-          <w:color w:val="2C2C2C"/>
-          <w:sz w:val="20"/>
-        </w:rPr>
-        <w:t>•  So funktioniert es</w:t>
-      </w:r>
-    </w:p>
-    <w:p>
-      <w:pPr>
-        <w:spacing w:after="60"/>
-      </w:pPr>
-      <w:r>
-        <w:rPr>
-          <w:rFonts w:ascii="Arial" w:hAnsi="Arial"/>
-          <w:color w:val="2C2C2C"/>
-          <w:sz w:val="20"/>
-        </w:rPr>
-        <w:t>•  In 3 Schritten zur Versorgung</w:t>
-      </w:r>
-    </w:p>
-    <w:p>
-      <w:pPr>
-        <w:spacing w:before="240" w:after="120"/>
-      </w:pPr>
-      <w:r>
-        <w:rPr>
-          <w:rFonts w:ascii="Georgia" w:hAnsi="Georgia"/>
-          <w:b/>
-          <w:color w:val="2C2C2C"/>
-          <w:sz w:val="23"/>
-        </w:rPr>
-        <w:t>Block: Jetzt kostenlos anfragen</w:t>
-      </w:r>
-    </w:p>
-    <w:p>
-      <w:pPr>
-        <w:spacing w:after="60"/>
-      </w:pPr>
-      <w:r>
-        <w:rPr>
-          <w:rFonts w:ascii="Arial" w:hAnsi="Arial"/>
-          <w:color w:val="2C2C2C"/>
-          <w:sz w:val="20"/>
-        </w:rPr>
-        <w:t>•  Jetzt kostenlos anfragen</w:t>
-      </w:r>
-    </w:p>
-    <w:p>
-      <w:pPr>
-        <w:spacing w:after="60"/>
-      </w:pPr>
-      <w:r>
-        <w:rPr>
-          <w:rFonts w:ascii="Arial" w:hAnsi="Arial"/>
-          <w:color w:val="2C2C2C"/>
-          <w:sz w:val="20"/>
-        </w:rPr>
-        <w:t>•  Wir sind für Sie da — persönlich, schnell und ohne Verpflichtung.</w:t>
-      </w:r>
-    </w:p>
-    <w:p>
-      <w:pPr>
-        <w:spacing w:after="60"/>
-      </w:pPr>
-      <w:r>
-        <w:rPr>
-          <w:rFonts w:ascii="Arial" w:hAnsi="Arial"/>
-          <w:color w:val="2C2C2C"/>
-          <w:sz w:val="20"/>
-        </w:rPr>
-        <w:t>•  Beratung anfragen</w:t>
-      </w:r>
-    </w:p>
-    <w:p>
-      <w:pPr>
-        <w:spacing w:after="60"/>
-      </w:pPr>
-      <w:r>
-        <w:rPr>
-          <w:rFonts w:ascii="Arial" w:hAnsi="Arial"/>
-          <w:color w:val="2C2C2C"/>
-          <w:sz w:val="20"/>
-        </w:rPr>
-        <w:t>•  05693 / 9189907</w:t>
-      </w:r>
-    </w:p>
-    <w:p>
-      <w:pPr>
-        <w:spacing w:before="240" w:after="120"/>
-      </w:pPr>
-      <w:r>
-        <w:rPr>
-          <w:rFonts w:ascii="Georgia" w:hAnsi="Georgia"/>
-          <w:b/>
-          <w:color w:val="2C2C2C"/>
-          <w:sz w:val="23"/>
-        </w:rPr>
-        <w:t>Block: Erfahren Sie mehr über uns</w:t>
-      </w:r>
-    </w:p>
-    <w:p>
-      <w:pPr>
-        <w:spacing w:after="60"/>
-      </w:pPr>
-      <w:r>
-        <w:rPr>
-          <w:rFonts w:ascii="Arial" w:hAnsi="Arial"/>
-          <w:color w:val="2C2C2C"/>
-          <w:sz w:val="20"/>
-        </w:rPr>
-        <w:t>•  Erfahren Sie mehr über uns</w:t>
-      </w:r>
-    </w:p>
-    <w:p>
-      <w:pPr>
-        <w:spacing w:after="60"/>
-      </w:pPr>
-      <w:r>
-        <w:rPr>
-          <w:rFonts w:ascii="Arial" w:hAnsi="Arial"/>
-          <w:color w:val="2C2C2C"/>
-          <w:sz w:val="20"/>
-        </w:rPr>
-        <w:t>•  Besuchen Sie unsere Hauptseite für ausführliche Informationen zu unseren Leistungen, dem Team und unserer Philosophie.</w:t>
-      </w:r>
-    </w:p>
-    <w:p>
-      <w:pPr>
-        <w:spacing w:after="60"/>
-      </w:pPr>
-      <w:r>
-        <w:rPr>
-          <w:rFonts w:ascii="Arial" w:hAnsi="Arial"/>
-          <w:color w:val="2C2C2C"/>
-          <w:sz w:val="20"/>
-        </w:rPr>
-        <w:t>•  Zur Hauptseite →</w:t>
+        <w:t>Wir sind für Sie da — persönlich, schnell und ohne Verpflichtung.</w:t>
       </w:r>
     </w:p>
     <w:sectPr>

</xml_diff>